<commit_message>
Seminar: interview-question column on the right, LTR number lists
Co-Authored-By: Claude Fable 5.1 <noreply@anthropic.com>
Claude-Session: https://claude.ai/code/session_01Lr9r31QBuGnh9pSHfrePL7
</commit_message>
<xml_diff>
--- a/seminar/סמינריון - טכנולוגיה בבית הספר העתידי.docx
+++ b/seminar/סמינריון - טכנולוגיה בבית הספר העתידי.docx
@@ -1888,7 +1888,7 @@
           </w:tcPr>
           <w:p>
             <w:pPr>
-              <w:bidi/>
+              <w:bidi w:val="false"/>
               <w:spacing w:after="0" w:before="0" w:line="276"/>
               <w:jc w:val="right"/>
             </w:pPr>
@@ -1901,7 +1901,7 @@
                 <w:iCs w:val="false"/>
                 <w:sz w:val="24"/>
                 <w:szCs w:val="24"/>
-                <w:rtl/>
+                <w:rtl w:val="false"/>
               </w:rPr>
               <w:t xml:space="preserve">29</w:t>
             </w:r>
@@ -2079,7 +2079,7 @@
           </w:tcPr>
           <w:p>
             <w:pPr>
-              <w:bidi/>
+              <w:bidi w:val="false"/>
               <w:spacing w:after="0" w:before="0" w:line="276"/>
               <w:jc w:val="right"/>
             </w:pPr>
@@ -2092,7 +2092,7 @@
                 <w:iCs w:val="false"/>
                 <w:sz w:val="24"/>
                 <w:szCs w:val="24"/>
-                <w:rtl/>
+                <w:rtl w:val="false"/>
               </w:rPr>
               <w:t xml:space="preserve">37</w:t>
             </w:r>
@@ -2270,7 +2270,7 @@
           </w:tcPr>
           <w:p>
             <w:pPr>
-              <w:bidi/>
+              <w:bidi w:val="false"/>
               <w:spacing w:after="0" w:before="0" w:line="276"/>
               <w:jc w:val="right"/>
             </w:pPr>
@@ -2283,7 +2283,7 @@
                 <w:iCs w:val="false"/>
                 <w:sz w:val="24"/>
                 <w:szCs w:val="24"/>
-                <w:rtl/>
+                <w:rtl w:val="false"/>
               </w:rPr>
               <w:t xml:space="preserve">45</w:t>
             </w:r>
@@ -2461,7 +2461,7 @@
           </w:tcPr>
           <w:p>
             <w:pPr>
-              <w:bidi/>
+              <w:bidi w:val="false"/>
               <w:spacing w:after="0" w:before="0" w:line="276"/>
               <w:jc w:val="right"/>
             </w:pPr>
@@ -2474,7 +2474,7 @@
                 <w:iCs w:val="false"/>
                 <w:sz w:val="24"/>
                 <w:szCs w:val="24"/>
-                <w:rtl/>
+                <w:rtl w:val="false"/>
               </w:rPr>
               <w:t xml:space="preserve">32</w:t>
             </w:r>
@@ -2652,7 +2652,7 @@
           </w:tcPr>
           <w:p>
             <w:pPr>
-              <w:bidi/>
+              <w:bidi w:val="false"/>
               <w:spacing w:after="0" w:before="0" w:line="276"/>
               <w:jc w:val="right"/>
             </w:pPr>
@@ -2665,7 +2665,7 @@
                 <w:iCs w:val="false"/>
                 <w:sz w:val="24"/>
                 <w:szCs w:val="24"/>
-                <w:rtl/>
+                <w:rtl w:val="false"/>
               </w:rPr>
               <w:t xml:space="preserve">41</w:t>
             </w:r>
@@ -2914,7 +2914,7 @@
                 <w:szCs w:val="24"/>
                 <w:rtl/>
               </w:rPr>
-              <w:t xml:space="preserve">שאלת משנה</w:t>
+              <w:t xml:space="preserve">שאלות ראיון עיקריות</w:t>
             </w:r>
           </w:p>
         </w:tc>
@@ -2946,7 +2946,7 @@
                 <w:szCs w:val="24"/>
                 <w:rtl/>
               </w:rPr>
-              <w:t xml:space="preserve">שאלות ראיון עיקריות</w:t>
+              <w:t xml:space="preserve">שאלת משנה</w:t>
             </w:r>
           </w:p>
         </w:tc>
@@ -2967,7 +2967,7 @@
           </w:tcPr>
           <w:p>
             <w:pPr>
-              <w:bidi/>
+              <w:bidi w:val="false"/>
               <w:spacing w:after="0" w:before="0" w:line="276"/>
               <w:jc w:val="right"/>
             </w:pPr>
@@ -2980,9 +2980,9 @@
                 <w:iCs w:val="false"/>
                 <w:sz w:val="24"/>
                 <w:szCs w:val="24"/>
-                <w:rtl/>
+                <w:rtl w:val="false"/>
               </w:rPr>
-              <w:t xml:space="preserve">1. יתרונות ותנאים למימושם</w:t>
+              <w:t xml:space="preserve">4, 6, 7, 8, 9, 13</w:t>
             </w:r>
           </w:p>
         </w:tc>
@@ -3013,7 +3013,7 @@
                 <w:szCs w:val="24"/>
                 <w:rtl/>
               </w:rPr>
-              <w:t xml:space="preserve">4, 6, 7, 8, 9, 13</w:t>
+              <w:t xml:space="preserve">1. יתרונות ותנאים למימושם</w:t>
             </w:r>
           </w:p>
         </w:tc>
@@ -3034,7 +3034,7 @@
           </w:tcPr>
           <w:p>
             <w:pPr>
-              <w:bidi/>
+              <w:bidi w:val="false"/>
               <w:spacing w:after="0" w:before="0" w:line="276"/>
               <w:jc w:val="right"/>
             </w:pPr>
@@ -3047,9 +3047,9 @@
                 <w:iCs w:val="false"/>
                 <w:sz w:val="24"/>
                 <w:szCs w:val="24"/>
-                <w:rtl/>
+                <w:rtl w:val="false"/>
               </w:rPr>
-              <w:t xml:space="preserve">2. קשיים, אתגרים והתמודדות</w:t>
+              <w:t xml:space="preserve">5, 10, 11, 12, 14, 17</w:t>
             </w:r>
           </w:p>
         </w:tc>
@@ -3080,7 +3080,7 @@
                 <w:szCs w:val="24"/>
                 <w:rtl/>
               </w:rPr>
-              <w:t xml:space="preserve">5, 10, 11, 12, 14, 17</w:t>
+              <w:t xml:space="preserve">2. קשיים, אתגרים והתמודדות</w:t>
             </w:r>
           </w:p>
         </w:tc>
@@ -3101,7 +3101,7 @@
           </w:tcPr>
           <w:p>
             <w:pPr>
-              <w:bidi/>
+              <w:bidi w:val="false"/>
               <w:spacing w:after="0" w:before="0" w:line="276"/>
               <w:jc w:val="right"/>
             </w:pPr>
@@ -3114,9 +3114,9 @@
                 <w:iCs w:val="false"/>
                 <w:sz w:val="24"/>
                 <w:szCs w:val="24"/>
-                <w:rtl/>
+                <w:rtl w:val="false"/>
               </w:rPr>
-              <w:t xml:space="preserve">3. תפקיד המורה, מה משתנה ומה נשאר</w:t>
+              <w:t xml:space="preserve">2, 15, 16, 18, 19, 20</w:t>
             </w:r>
           </w:p>
         </w:tc>
@@ -3147,7 +3147,7 @@
                 <w:szCs w:val="24"/>
                 <w:rtl/>
               </w:rPr>
-              <w:t xml:space="preserve">2, 15, 16, 18, 19, 20</w:t>
+              <w:t xml:space="preserve">3. תפקיד המורה: מה משתנה ומה נשאר</w:t>
             </w:r>
           </w:p>
         </w:tc>
@@ -3168,7 +3168,7 @@
           </w:tcPr>
           <w:p>
             <w:pPr>
-              <w:bidi/>
+              <w:bidi w:val="false"/>
               <w:spacing w:after="0" w:before="0" w:line="276"/>
               <w:jc w:val="right"/>
             </w:pPr>
@@ -3181,9 +3181,9 @@
                 <w:iCs w:val="false"/>
                 <w:sz w:val="24"/>
                 <w:szCs w:val="24"/>
-                <w:rtl/>
+                <w:rtl w:val="false"/>
               </w:rPr>
-              <w:t xml:space="preserve">רקע ובניית אמון</w:t>
+              <w:t xml:space="preserve">1, 3</w:t>
             </w:r>
           </w:p>
         </w:tc>
@@ -3214,7 +3214,7 @@
                 <w:szCs w:val="24"/>
                 <w:rtl/>
               </w:rPr>
-              <w:t xml:space="preserve">1, 3</w:t>
+              <w:t xml:space="preserve">רקע ובניית אמון</w:t>
             </w:r>
           </w:p>
         </w:tc>
@@ -9852,7 +9852,7 @@
           </w:tcPr>
           <w:p>
             <w:pPr>
-              <w:bidi/>
+              <w:bidi w:val="false"/>
               <w:spacing w:after="0" w:before="0" w:line="276"/>
               <w:jc w:val="right"/>
             </w:pPr>
@@ -9865,7 +9865,7 @@
                 <w:iCs w:val="false"/>
                 <w:sz w:val="24"/>
                 <w:szCs w:val="24"/>
-                <w:rtl/>
+                <w:rtl w:val="false"/>
               </w:rPr>
               <w:t xml:space="preserve">29</w:t>
             </w:r>
@@ -10043,7 +10043,7 @@
           </w:tcPr>
           <w:p>
             <w:pPr>
-              <w:bidi/>
+              <w:bidi w:val="false"/>
               <w:spacing w:after="0" w:before="0" w:line="276"/>
               <w:jc w:val="right"/>
             </w:pPr>
@@ -10056,7 +10056,7 @@
                 <w:iCs w:val="false"/>
                 <w:sz w:val="24"/>
                 <w:szCs w:val="24"/>
-                <w:rtl/>
+                <w:rtl w:val="false"/>
               </w:rPr>
               <w:t xml:space="preserve">37</w:t>
             </w:r>
@@ -10234,7 +10234,7 @@
           </w:tcPr>
           <w:p>
             <w:pPr>
-              <w:bidi/>
+              <w:bidi w:val="false"/>
               <w:spacing w:after="0" w:before="0" w:line="276"/>
               <w:jc w:val="right"/>
             </w:pPr>
@@ -10247,7 +10247,7 @@
                 <w:iCs w:val="false"/>
                 <w:sz w:val="24"/>
                 <w:szCs w:val="24"/>
-                <w:rtl/>
+                <w:rtl w:val="false"/>
               </w:rPr>
               <w:t xml:space="preserve">45</w:t>
             </w:r>
@@ -10425,7 +10425,7 @@
           </w:tcPr>
           <w:p>
             <w:pPr>
-              <w:bidi/>
+              <w:bidi w:val="false"/>
               <w:spacing w:after="0" w:before="0" w:line="276"/>
               <w:jc w:val="right"/>
             </w:pPr>
@@ -10438,7 +10438,7 @@
                 <w:iCs w:val="false"/>
                 <w:sz w:val="24"/>
                 <w:szCs w:val="24"/>
-                <w:rtl/>
+                <w:rtl w:val="false"/>
               </w:rPr>
               <w:t xml:space="preserve">32</w:t>
             </w:r>
@@ -10616,7 +10616,7 @@
           </w:tcPr>
           <w:p>
             <w:pPr>
-              <w:bidi/>
+              <w:bidi w:val="false"/>
               <w:spacing w:after="0" w:before="0" w:line="276"/>
               <w:jc w:val="right"/>
             </w:pPr>
@@ -10629,7 +10629,7 @@
                 <w:iCs w:val="false"/>
                 <w:sz w:val="24"/>
                 <w:szCs w:val="24"/>
-                <w:rtl/>
+                <w:rtl w:val="false"/>
               </w:rPr>
               <w:t xml:space="preserve">41</w:t>
             </w:r>

</xml_diff>

<commit_message>
Seminar: remove URLs from Hebrew references
Co-Authored-By: Claude Fable 5.1 <noreply@anthropic.com>
Claude-Session: https://claude.ai/code/session_01Lr9r31QBuGnh9pSHfrePL7
</commit_message>
<xml_diff>
--- a/seminar/סמינריון - טכנולוגיה בבית הספר העתידי.docx
+++ b/seminar/סמינריון - טכנולוגיה בבית הספר העתידי.docx
@@ -6488,7 +6488,7 @@
           <w:szCs w:val="24"/>
           <w:rtl/>
         </w:rPr>
-        <w:t xml:space="preserve">. האוניברסיטה הפתוחה. https://www.openu.ac.il/Lists/MediaServer_Documents/innovation/chais/2026/a1_2.pdf</w:t>
+        <w:t xml:space="preserve">. האוניברסיטה הפתוחה.</w:t>
       </w:r>
     </w:p>
     <w:p>
@@ -6535,7 +6535,7 @@
           <w:szCs w:val="24"/>
           <w:rtl/>
         </w:rPr>
-        <w:t xml:space="preserve">. האוניברסיטה הפתוחה. https://www.openu.ac.il/Lists/MediaServer_Documents/innovation/chais/2023/b1_1.pdf</w:t>
+        <w:t xml:space="preserve">. האוניברסיטה הפתוחה.</w:t>
       </w:r>
     </w:p>
     <w:p>
@@ -6608,7 +6608,7 @@
           <w:szCs w:val="24"/>
           <w:rtl/>
         </w:rPr>
-        <w:t xml:space="preserve">, 205-222. https://journals.edu.haifa.ac.il/</w:t>
+        <w:t xml:space="preserve">, 205-222.</w:t>
       </w:r>
     </w:p>
     <w:p>
@@ -6681,7 +6681,7 @@
           <w:szCs w:val="24"/>
           <w:rtl/>
         </w:rPr>
-        <w:t xml:space="preserve">. https://www.smkb.ac.il/media/0e5gto1f/giluy-daat-22_hagit.pdf</w:t>
+        <w:t xml:space="preserve">.</w:t>
       </w:r>
     </w:p>
     <w:p>
@@ -6754,7 +6754,7 @@
           <w:szCs w:val="24"/>
           <w:rtl/>
         </w:rPr>
-        <w:t xml:space="preserve">. https://www.l-w.ac.il/articles/researchers-early-childhood/gilyonot/issue-6/</w:t>
+        <w:t xml:space="preserve">.</w:t>
       </w:r>
     </w:p>
     <w:p>
@@ -6827,7 +6827,7 @@
           <w:szCs w:val="24"/>
           <w:rtl/>
         </w:rPr>
-        <w:t xml:space="preserve">. https://www.smkb.ac.il/media/ml1bcpvu/gilui-daat-20-idit-shira.pdf</w:t>
+        <w:t xml:space="preserve">.</w:t>
       </w:r>
     </w:p>
     <w:p>
@@ -6874,7 +6874,7 @@
           <w:szCs w:val="24"/>
           <w:rtl/>
         </w:rPr>
-        <w:t xml:space="preserve">. https://dapim.mofet.macam.ac.il/</w:t>
+        <w:t xml:space="preserve">.</w:t>
       </w:r>
     </w:p>
     <w:p>
@@ -6921,7 +6921,7 @@
           <w:szCs w:val="24"/>
           <w:rtl/>
         </w:rPr>
-        <w:t xml:space="preserve"> (עמ' 94-105). האוניברסיטה הפתוחה. https://www.openu.ac.il/Lists/MediaServer_Documents/innovation/chais/2022/chais-2022_to_print.pdf</w:t>
+        <w:t xml:space="preserve"> (עמ' 94-105). האוניברסיטה הפתוחה.</w:t>
       </w:r>
     </w:p>
     <w:p>
@@ -6968,7 +6968,7 @@
           <w:szCs w:val="24"/>
           <w:rtl/>
         </w:rPr>
-        <w:t xml:space="preserve"> (עמ' 162-175). האוניברסיטה הפתוחה. https://www.openu.ac.il/Lists/MediaServer_Documents/entrepreneurship/chais2021.pdf</w:t>
+        <w:t xml:space="preserve"> (עמ' 162-175). האוניברסיטה הפתוחה.</w:t>
       </w:r>
     </w:p>
     <w:p>

</xml_diff>

<commit_message>
Seminar: Levinsky College logo and name on cover page
Co-Authored-By: Claude Fable 5.1 <noreply@anthropic.com>
Claude-Session: https://claude.ai/code/session_01Lr9r31QBuGnh9pSHfrePL7
</commit_message>
<xml_diff>
--- a/seminar/סמינריון - טכנולוגיה בבית הספר העתידי.docx
+++ b/seminar/סמינריון - טכנולוגיה בבית הספר העתידי.docx
@@ -4,6 +4,52 @@
   <w:body>
     <w:p>
       <w:pPr>
+        <w:spacing w:after="240"/>
+        <w:jc w:val="center"/>
+      </w:pPr>
+      <w:r>
+        <w:drawing>
+          <wp:inline distT="0" distB="0" distL="0" distR="0">
+            <wp:extent cx="2762250" cy="1333500"/>
+            <wp:effectExtent t="0" r="0" b="0" l="0"/>
+            <wp:docPr id="1" name="" descr="" title=""/>
+            <wp:cNvGraphicFramePr>
+              <a:graphicFrameLocks xmlns:a="http://schemas.openxmlformats.org/drawingml/2006/main" noChangeAspect="1"/>
+            </wp:cNvGraphicFramePr>
+            <a:graphic xmlns:a="http://schemas.openxmlformats.org/drawingml/2006/main">
+              <a:graphicData uri="http://schemas.openxmlformats.org/drawingml/2006/picture">
+                <pic:pic xmlns:pic="http://schemas.openxmlformats.org/drawingml/2006/picture">
+                  <pic:nvPicPr>
+                    <pic:cNvPr id="0" name="" descr=""/>
+                    <pic:cNvPicPr>
+                      <a:picLocks noChangeAspect="1" noChangeArrowheads="1"/>
+                    </pic:cNvPicPr>
+                  </pic:nvPicPr>
+                  <pic:blipFill>
+                    <a:blip r:embed="rId8" cstate="none"/>
+                    <a:srcRect/>
+                    <a:stretch>
+                      <a:fillRect/>
+                    </a:stretch>
+                  </pic:blipFill>
+                  <pic:spPr bwMode="auto">
+                    <a:xfrm>
+                      <a:off x="0" y="0"/>
+                      <a:ext cx="2762250" cy="1333500"/>
+                    </a:xfrm>
+                    <a:prstGeom prst="rect">
+                      <a:avLst/>
+                    </a:prstGeom>
+                  </pic:spPr>
+                </pic:pic>
+              </a:graphicData>
+            </a:graphic>
+          </wp:inline>
+        </w:drawing>
+      </w:r>
+    </w:p>
+    <w:p>
+      <w:pPr>
         <w:bidi/>
         <w:spacing w:after="160" w:before="0" w:line="360"/>
         <w:jc w:val="center"/>
@@ -19,7 +65,7 @@
           <w:szCs w:val="26"/>
           <w:rtl/>
         </w:rPr>
-        <w:t xml:space="preserve">המכללה האקדמית, החוג לחינוך</w:t>
+        <w:t xml:space="preserve">מכללת לוינסקי לחינוך</w:t>
       </w:r>
     </w:p>
     <w:p>

</xml_diff>

<commit_message>
Seminar: add Atias et al. (2026) and Ministry of Education AI guidelines (2026) to review, discussion and references
Co-Authored-By: Claude Fable 5.1 <noreply@anthropic.com>
Claude-Session: https://claude.ai/code/session_01Lr9r31QBuGnh9pSHfrePL7
</commit_message>
<xml_diff>
--- a/seminar/סמינריון - טכנולוגיה בבית הספר העתידי.docx
+++ b/seminar/סמינריון - טכנולוגיה בבית הספר העתידי.docx
@@ -1159,6 +1159,46 @@
           <w:rtl/>
         </w:rPr>
         <w:t xml:space="preserve">בישראל, מאמר עיוני על אתגרי השימוש ב־ChatGPT בחן את השפעותיו האפשריות על הכתיבה כאמצעי למידה, על הערכת מידע, על מטלות ביצוע ועל הערכת הלומד. המאמר קבע שהכלי תומך בביצוע מטלות כתיבה, אך שימוש מושכל בו דורש ידע מוקדם וחשיבה ביקורתית, ולכן הוא אינו מייתר את המורה אלא משנה את תפקידו ומאתגר את דרכי ההערכה (מישר-טל, 2024). מחקר כמותי בקרב מורים בישראל, המבוסס על מודל קבלת השימוש במכשירי בינה מלאכותית, מצא שאימוץ בינה מלאכותית יוצרת להוראה מוסבר בתועלת הנתפסת, ברגשות ובהשפעה חברתית גם יחד, ממצא המדגיש את חשיבות הקהילה המקצועית בתהליך האימוץ (בלאו ואחרים, 2026).</w:t>
+      </w:r>
+    </w:p>
+    <w:p>
+      <w:pPr>
+        <w:bidi/>
+        <w:spacing w:after="120" w:before="0" w:line="360"/>
+        <w:jc w:val="both"/>
+      </w:pPr>
+      <w:r>
+        <w:rPr>
+          <w:rFonts w:ascii="David" w:cs="David" w:eastAsia="David" w:hAnsi="David"/>
+          <w:b w:val="false"/>
+          <w:bCs w:val="false"/>
+          <w:i w:val="false"/>
+          <w:iCs w:val="false"/>
+          <w:sz w:val="24"/>
+          <w:szCs w:val="24"/>
+          <w:rtl/>
+        </w:rPr>
+        <w:t xml:space="preserve">מדיניות משרד החינוך בישראל מציבה את השימוש של תלמידים בכלים אלה במדרג גילאים ברור. על פי ההנחיות לשימוש בכלי בינה מלאכותית יוצרת במערכת החינוך, שפורסמו בינואר 2026, אין להשתמש בבוטים לימודיים מבוססי בינה מלאכותית יוצרת בכיתות א' עד ג'; מכיתה ד' מותר שימוש בבוט חינוכי ייעודי של משרד החינוך בלבד, בפיקוח צוות ההוראה; בכיתות ה' ו־ו' מותר שימוש בכלים מאושרים בשליטת המורה וללא הזדהות אישית של התלמיד; ורק מכיתה ז' מותר שימוש עצמאי בכלים מאושרים. ההנחיות מחייבות אישור הורים והכשרה מקדימה של הצוות והתלמידים, ומונות בין הסיכונים הטיה, פגיעה בפרטיות, מידע כוזב, הסתמכות יתר שעלולה לפגוע בחשיבה עצמאית, תלות רגשית וחברתית ופער דיגיטלי (משרד החינוך, 2026). בבית הספר היסודי, אם כן, האחריות לשימוש בכלים אלה מוטלת כמעט כולה על המורה: היא שמכינה באמצעותם חומרים, היא שמציגה אותם בכיתה, והיא שנדרשת ללמד את התלמידים חשיבה ביקורתית כלפיהם.</w:t>
+      </w:r>
+    </w:p>
+    <w:p>
+      <w:pPr>
+        <w:bidi/>
+        <w:spacing w:after="120" w:before="0" w:line="360"/>
+        <w:jc w:val="both"/>
+      </w:pPr>
+      <w:r>
+        <w:rPr>
+          <w:rFonts w:ascii="David" w:cs="David" w:eastAsia="David" w:hAnsi="David"/>
+          <w:b w:val="false"/>
+          <w:bCs w:val="false"/>
+          <w:i w:val="false"/>
+          <w:iCs w:val="false"/>
+          <w:sz w:val="24"/>
+          <w:szCs w:val="24"/>
+          <w:rtl/>
+        </w:rPr>
+        <w:t xml:space="preserve">ההשפעה של כלים אלה על עבודת המורה עצמה נחקרה במחקר ישראלי בקרב תשעים ושמונה מורות ומורים, שבחן את הקשר בין רמת השימוש בבינה מלאכותית לבין תחושת עומס ושחיקה. בניגוד להשערת החוקרים, מורים שדיווחו על שימוש בבינה מלאכותית להכנת חומרי הוראה או להפעלת תלמידים דיווחו על עומס ושחיקה גבוהים יותר, ככל הנראה משום שנדרשו להשקיע זמן בלמידת הכלים ללא הכשרה מספקת. מיומנות טכנולוגית ועמדות כלפי בינה מלאכותית לא הסבירו את העומס, ואילו פתיחות לשינוי נמצאה בקשר שלילי עם שחיקה. החוקרים הסיקו שקיים פער בין הפוטנציאל של הכלים להפחית עומס לבין המציאות בשטח, ושמימושו מחייב הכשרה, זמן ייעודי להתנסות ותמיכה מוסדית רציפה (אטיאס ואחרים, 2026). ממצא זה מצטרף לממצאים על העומס שהמעבר לתפקיד מורחב יוצר, ומדגיש שהכלי אינו מפחית עומס מעצמו.</w:t>
       </w:r>
     </w:p>
     <w:p>
@@ -6138,7 +6178,7 @@
           <w:szCs w:val="24"/>
           <w:rtl/>
         </w:rPr>
-        <w:t xml:space="preserve">שאלת המשנה השלישית עסקה בשינוי בתפקיד המורה. הממצאים מאששים באופן מלא את הדפוס שהספרות מתארת: מעבר ממקור ידע למתכננת, מתווכת ומפרשת נתונים, לצד ליבה יחסית שנתפסת כבלתי ניתנת להחלפה (Merikko &amp; Kivimäki, 2022; Moltudal et al., 2022; Tripathi et al., 2025). דבריה של יעל, "המחשב יכול לתת מידע, אבל הוא לא מכיר את הילד כמו שאני מכירה אותו", מנוסחים כמעט כמו כותרת מאמרם של מריקו וקיוומקי, "להחליף מורים? בספק" (Merikko &amp; Kivimäki, 2022). ואולם הראיונות מוסיפים שני ממדים. הראשון הוא העומס: שלוש מרואיינות הדגישו שהתפקיד התרחב ושדבר לא הוסר ממנו, ממצא התואם את מה שמצא המחקר על שחיקת מורים בעקבות אימוץ כלי בינה מלאכותית ללא הכשרה (Kim, 2025). השני הוא הידע השקט על הילד, שרונית תיארה כ"ידע שנבנה משנה של מבטים והפסקות". ידע זה, שאינו כתוב בשום מערכת, הוא לתפיסת המורות הדבר שמצדיק את קיומן בכיתה גם כשהמידע זמין בכל מקום.</w:t>
+        <w:t xml:space="preserve">שאלת המשנה השלישית עסקה בשינוי בתפקיד המורה. הממצאים מאששים באופן מלא את הדפוס שהספרות מתארת: מעבר ממקור ידע למתכננת, מתווכת ומפרשת נתונים, לצד ליבה יחסית שנתפסת כבלתי ניתנת להחלפה (Merikko &amp; Kivimäki, 2022; Moltudal et al., 2022; Tripathi et al., 2025). דבריה של יעל, "המחשב יכול לתת מידע, אבל הוא לא מכיר את הילד כמו שאני מכירה אותו", מנוסחים כמעט כמו כותרת מאמרם של מריקו וקיוומקי, "להחליף מורים? בספק" (Merikko &amp; Kivimäki, 2022). ואולם הראיונות מוסיפים שני ממדים. הראשון הוא העומס: שלוש מרואיינות הדגישו שהתפקיד התרחב ושדבר לא הוסר ממנו, ממצא התואם את המחקר הישראלי שמצא כי שימוש בבינה מלאכותית להכנת חומרים היה קשור דווקא לעומס ולשחיקה גבוהים יותר כאשר לא לווה בהכשרה ובזמן (אטיאס ואחרים, 2026), ואת הממצא שמורים ללא תכנון מוסדי חשים מוכנים פחות לאימוץ הכלים (Kim, 2025). השני הוא הידע השקט על הילד, שרונית תיארה כ"ידע שנבנה משנה של מבטים והפסקות". ידע זה, שאינו כתוב בשום מערכת, הוא לתפיסת המורות הדבר שמצדיק את קיומן בכיתה גם כשהמידע זמין בכל מקום.</w:t>
       </w:r>
     </w:p>
     <w:p>
@@ -6178,7 +6218,7 @@
           <w:szCs w:val="24"/>
           <w:rtl/>
         </w:rPr>
-        <w:t xml:space="preserve">היחס לבינה מלאכותית יוצרת היה אחיד באופן שמפתיע לנוכח הפחד שתואר בחדרי המורים: שימוש קבוע להכנת חומרים, בדיקה קפדנית של הפלט, זהירות עם תלמידים צעירים, והפיכת הטעויות של הכלי לשיעור בחשיבה ביקורתית. תפיסה זו תואמת את מסקנתה של מישר-טל (2024) שהכלי אינו מייתר את המורה אלא משנה את תפקידו, ומאששת את הממצא שמורים חווים את הבינה המלאכותית כמערערת על סמכותם ומחייבת ניסוח מחדש של תפקידם (Tripathi et al., 2025). החשש המשותף למרואיינות, שהילדים ידלגו על המאמץ שבו מתרחשת הלמידה, ממקד את הדיון בשאלה פדגוגית ולא בשאלת ההעתקה. הממצא שכל חמש המורות מאמצות את הכלי לעבודתן שלהן תוך זהירות כלפי התלמידים תואם גם את הממצא הישראלי שאימוץ בינה מלאכותית מוסבר ברגשות ובהשפעה חברתית ולא בתועלת בלבד (בלאו ואחרים, 2026).</w:t>
+        <w:t xml:space="preserve">היחס לבינה מלאכותית יוצרת היה אחיד באופן שמפתיע לנוכח הפחד שתואר בחדרי המורים: שימוש קבוע להכנת חומרים, בדיקה קפדנית של הפלט, זהירות עם תלמידים צעירים, והפיכת הטעויות של הכלי לשיעור בחשיבה ביקורתית. תפיסה זו תואמת את מסקנתה של מישר-טל (2024) שהכלי אינו מייתר את המורה אלא משנה את תפקידו, ומאששת את הממצא שמורים חווים את הבינה המלאכותית כמערערת על סמכותם ומחייבת ניסוח מחדש של תפקידם (Tripathi et al., 2025). הזהירות שהמורות נוקטות כלפי תלמידיהן הצעירים תואמת גם את מדרג הגילאים שקבע משרד החינוך, האוסר שימוש בבוטים מבוססי בינה מלאכותית יוצרת בכיתות א' עד ג' ומתיר בכיתות ה' ו־ו' שימוש בשליטת המורה בלבד (משרד החינוך, 2026); הפרקטיקה של הקרנת תשובה של הכלי על המקרן ובדיקתה עם הכיתה, שתיארו שלוש מרואיינות, היא בדיוק אופן השימוש שההנחיות מתירות בגילאים אלה. החשש המשותף למרואיינות, שהילדים ידלגו על המאמץ שבו מתרחשת הלמידה, מקביל לסיכון של הסתמכות יתר המופיע בהנחיות, והוא ממקד את הדיון בשאלה פדגוגית ולא בשאלת ההעתקה. הממצא שכל חמש המורות מאמצות את הכלי לעבודתן שלהן תוך זהירות כלפי התלמידים תואם גם את הממצא הישראלי שאימוץ בינה מלאכותית מוסבר ברגשות ובהשפעה חברתית ולא בתועלת בלבד (בלאו ואחרים, 2026).</w:t>
       </w:r>
     </w:p>
     <w:p>
@@ -6383,7 +6423,7 @@
           <w:szCs w:val="24"/>
           <w:rtl/>
         </w:rPr>
-        <w:t xml:space="preserve">מבחינה מעשית, לשדה החינוכי עולות מן הממצאים המלצות קונקרטיות. למנהלי בתי ספר: לקבוע את הסדר "קודם פדגוגיה, אחר כך רכישה", ולהגדיר לפני כל רכישת ציוד מה הילדים אמורים לעשות בו; להקצות שעה שבועית קבועה בתוך מערכת השעות ללמידת עמיתים בנושא שילוב טכנולוגיה, ולצוות בה מורה ותיקה למורה צעירה; ולקבוע כלל בית ספרי שלפיו אין משימת חובה דיגיטלית לבית ללא חלופה, ושחדר המחשבים פתוח לתלמידים לאחר שעות הלימודים. למפתחי הכשרות: לבנות השתלמויות סביב שיעורים אמיתיים, כולל מה שהשתבש בהם, ולעסוק בשאלה מתי כלי מתאים ומתי לא, ולא באופן הפעלתו בלבד; לכלול בהכשרה תכנים של פרטיות, הערכת מידע ובינה מלאכותית, שהמורות מדווחות כי למדו בעצמן. למורות: לתכנן לכל שיעור עם מסך גם חלק ללא מסך ותוכנית חלופית; לבדוק הבנה בדרך שאינה תלויה במסך לאחר כל פעילות דיגיטלית; ולשאול לפני הכנסת כלי חדש מי בכיתה לא יוכל להשתמש בו ומה ייעשה עבורו. לקובעי מדיניות: למדוד חדשנות לא לפי מספר הכלים שבשימוש אלא לפי מה שהתלמידים יודעים לעשות, ולהכיר בכך שהתפקיד התרחב ולתת לכך ביטוי בזמן ובתקינה.</w:t>
+        <w:t xml:space="preserve">מבחינה מעשית, לשדה החינוכי עולות מן הממצאים המלצות קונקרטיות. למנהלי בתי ספר: לקבוע את הסדר "קודם פדגוגיה, אחר כך רכישה", ולהגדיר לפני כל רכישת ציוד מה הילדים אמורים לעשות בו; להקצות שעה שבועית קבועה בתוך מערכת השעות ללמידת עמיתים בנושא שילוב טכנולוגיה, ולצוות בה מורה ותיקה למורה צעירה; ולקבוע כלל בית ספרי שלפיו אין משימת חובה דיגיטלית לבית ללא חלופה, ושחדר המחשבים פתוח לתלמידים לאחר שעות הלימודים. למפתחי הכשרות: לבנות השתלמויות סביב שיעורים אמיתיים, כולל מה שהשתבש בהם, ולעסוק בשאלה מתי כלי מתאים ומתי לא, ולא באופן הפעלתו בלבד; לכלול בהכשרה תכנים של פרטיות, הערכת מידע ובינה מלאכותית, שהמורות מדווחות כי למדו בעצמן, ולעגן בה את מדרג הגילאים ואת חובת אישור ההורים שקבע משרד החינוך (משרד החינוך, 2026). למורות: לתכנן לכל שיעור עם מסך גם חלק ללא מסך ותוכנית חלופית; לבדוק הבנה בדרך שאינה תלויה במסך לאחר כל פעילות דיגיטלית; ולשאול לפני הכנסת כלי חדש מי בכיתה לא יוכל להשתמש בו ומה ייעשה עבורו. לקובעי מדיניות: למדוד חדשנות לא לפי מספר הכלים שבשימוש אלא לפי מה שהתלמידים יודעים לעשות, ולהכיר בכך שהתפקיד התרחב ולתת לכך ביטוי בזמן ובתקינה.</w:t>
       </w:r>
     </w:p>
     <w:p>
@@ -6508,7 +6548,7 @@
           <w:szCs w:val="24"/>
           <w:rtl/>
         </w:rPr>
-        <w:t xml:space="preserve">בלאו, א', אולניק-שמש, ד', גרי, נ', כספי, א', סידי, י', עשת-אלקלעי, י' וקלמן, י' (2026). אימוץ בינה מלאכותית יוצרת (GenAI) לצרכי הוראה בקרב מורים. בתוך </w:t>
+        <w:t xml:space="preserve">אטיאס, ע', בן אור, ז', הראל בן עזרא, ש', מישר-טל, ח' ורבין, א' (2026). הקשר בין שימוש בבינה מלאכותית לבין שחיקה ועומס בעבודת המורה [פוסטר]. בתוך א' בלאו, ד' אולניק-שמש, נ' גרי, א' כספי, י' סידי, י' עשת-אלקלעי, י' קלמן ונ' ברנדל (עורכים), </w:t>
       </w:r>
       <w:r>
         <w:rPr>
@@ -6534,7 +6574,7 @@
           <w:szCs w:val="24"/>
           <w:rtl/>
         </w:rPr>
-        <w:t xml:space="preserve">. האוניברסיטה הפתוחה.</w:t>
+        <w:t xml:space="preserve"> (עמ' 219-221). האוניברסיטה הפתוחה.</w:t>
       </w:r>
     </w:p>
     <w:p>
@@ -6555,7 +6595,7 @@
           <w:szCs w:val="24"/>
           <w:rtl/>
         </w:rPr>
-        <w:t xml:space="preserve">חודטוב, ס' ואבידב-אונגר, א' (2023). שילוב של משחק דיגיטלי בבתי ספר יסודיים: נקודת המבט של המורים. בתוך </w:t>
+        <w:t xml:space="preserve">בלאו, א', אולניק-שמש, ד', גרי, נ', כספי, א', סידי, י', עשת-אלקלעי, י' וקלמן, י' (2026). אימוץ בינה מלאכותית יוצרת (GenAI) לצרכי הוראה בקרב מורים. בתוך </w:t>
       </w:r>
       <w:r>
         <w:rPr>
@@ -6568,7 +6608,7 @@
           <w:szCs w:val="24"/>
           <w:rtl/>
         </w:rPr>
-        <w:t xml:space="preserve">האדם הלומד בעידן הדיגיטלי: ספר הכנס השמונה-עשר לחקר חדשנות וטכנולוגיות למידה ע"ש צ'ייס</w:t>
+        <w:t xml:space="preserve">האדם הלומד בעידן הדיגיטלי: ספר הכנס העשרים ואחד לחקר חדשנות וטכנולוגיות למידה ע"ש צ'ייס</w:t>
       </w:r>
       <w:r>
         <w:rPr>
@@ -6602,7 +6642,7 @@
           <w:szCs w:val="24"/>
           <w:rtl/>
         </w:rPr>
-        <w:t xml:space="preserve">כהן זכריה, מ' וטובין, ד' (2024). משבר כהזדמנות? צוות מחנכות לפני הקורונה, בזמן המגפה ואחריה. </w:t>
+        <w:t xml:space="preserve">חודטוב, ס' ואבידב-אונגר, א' (2023). שילוב של משחק דיגיטלי בבתי ספר יסודיים: נקודת המבט של המורים. בתוך </w:t>
       </w:r>
       <w:r>
         <w:rPr>
@@ -6615,20 +6655,41 @@
           <w:szCs w:val="24"/>
           <w:rtl/>
         </w:rPr>
-        <w:t xml:space="preserve">עיונים בחינוך</w:t>
-      </w:r>
-      <w:r>
-        <w:rPr>
-          <w:rFonts w:ascii="David" w:cs="David" w:eastAsia="David" w:hAnsi="David"/>
-          <w:b w:val="false"/>
-          <w:bCs w:val="false"/>
-          <w:i w:val="false"/>
-          <w:iCs w:val="false"/>
-          <w:sz w:val="24"/>
-          <w:szCs w:val="24"/>
-          <w:rtl/>
-        </w:rPr>
-        <w:t xml:space="preserve">, </w:t>
+        <w:t xml:space="preserve">האדם הלומד בעידן הדיגיטלי: ספר הכנס השמונה-עשר לחקר חדשנות וטכנולוגיות למידה ע"ש צ'ייס</w:t>
+      </w:r>
+      <w:r>
+        <w:rPr>
+          <w:rFonts w:ascii="David" w:cs="David" w:eastAsia="David" w:hAnsi="David"/>
+          <w:b w:val="false"/>
+          <w:bCs w:val="false"/>
+          <w:i w:val="false"/>
+          <w:iCs w:val="false"/>
+          <w:sz w:val="24"/>
+          <w:szCs w:val="24"/>
+          <w:rtl/>
+        </w:rPr>
+        <w:t xml:space="preserve">. האוניברסיטה הפתוחה.</w:t>
+      </w:r>
+    </w:p>
+    <w:p>
+      <w:pPr>
+        <w:bidi/>
+        <w:spacing w:after="120" w:before="0" w:line="360"/>
+        <w:ind w:right="720" w:hanging="720"/>
+        <w:jc w:val="right"/>
+      </w:pPr>
+      <w:r>
+        <w:rPr>
+          <w:rFonts w:ascii="David" w:cs="David" w:eastAsia="David" w:hAnsi="David"/>
+          <w:b w:val="false"/>
+          <w:bCs w:val="false"/>
+          <w:i w:val="false"/>
+          <w:iCs w:val="false"/>
+          <w:sz w:val="24"/>
+          <w:szCs w:val="24"/>
+          <w:rtl/>
+        </w:rPr>
+        <w:t xml:space="preserve">כהן זכריה, מ' וטובין, ד' (2024). משבר כהזדמנות? צוות מחנכות לפני הקורונה, בזמן המגפה ואחריה. </w:t>
       </w:r>
       <w:r>
         <w:rPr>
@@ -6641,6 +6702,32 @@
           <w:szCs w:val="24"/>
           <w:rtl/>
         </w:rPr>
+        <w:t xml:space="preserve">עיונים בחינוך</w:t>
+      </w:r>
+      <w:r>
+        <w:rPr>
+          <w:rFonts w:ascii="David" w:cs="David" w:eastAsia="David" w:hAnsi="David"/>
+          <w:b w:val="false"/>
+          <w:bCs w:val="false"/>
+          <w:i w:val="false"/>
+          <w:iCs w:val="false"/>
+          <w:sz w:val="24"/>
+          <w:szCs w:val="24"/>
+          <w:rtl/>
+        </w:rPr>
+        <w:t xml:space="preserve">, </w:t>
+      </w:r>
+      <w:r>
+        <w:rPr>
+          <w:rFonts w:ascii="David" w:cs="David" w:eastAsia="David" w:hAnsi="David"/>
+          <w:b w:val="false"/>
+          <w:bCs w:val="false"/>
+          <w:i/>
+          <w:iCs/>
+          <w:sz w:val="24"/>
+          <w:szCs w:val="24"/>
+          <w:rtl/>
+        </w:rPr>
         <w:t xml:space="preserve">24</w:t>
       </w:r>
       <w:r>
@@ -6675,7 +6762,7 @@
           <w:szCs w:val="24"/>
           <w:rtl/>
         </w:rPr>
-        <w:t xml:space="preserve">מישר-טל, ח' (2024). למידה והוראה בעידן הבינה המלאכותית: אתגרי השימוש ב-ChatGPT. </w:t>
+        <w:t xml:space="preserve">מגן-נגר, נ' ופירסטטר, א' (2017). מכשולים בהטמעת התקשוב בגני הילדים: תפיסות של גננות. </w:t>
       </w:r>
       <w:r>
         <w:rPr>
@@ -6688,7 +6775,7 @@
           <w:szCs w:val="24"/>
           <w:rtl/>
         </w:rPr>
-        <w:t xml:space="preserve">גילוי דעת</w:t>
+        <w:t xml:space="preserve">חוקרים@הגיל הרך</w:t>
       </w:r>
       <w:r>
         <w:rPr>
@@ -6714,7 +6801,7 @@
           <w:szCs w:val="24"/>
           <w:rtl/>
         </w:rPr>
-        <w:t xml:space="preserve">22</w:t>
+        <w:t xml:space="preserve">6</w:t>
       </w:r>
       <w:r>
         <w:rPr>
@@ -6748,7 +6835,7 @@
           <w:szCs w:val="24"/>
           <w:rtl/>
         </w:rPr>
-        <w:t xml:space="preserve">מגן-נגר, נ' ופירסטטר, א' (2017). מכשולים בהטמעת התקשוב בגני הילדים: תפיסות של גננות. </w:t>
+        <w:t xml:space="preserve">מישר-טל, ח' (2024). למידה והוראה בעידן הבינה המלאכותית: אתגרי השימוש ב-ChatGPT. </w:t>
       </w:r>
       <w:r>
         <w:rPr>
@@ -6761,7 +6848,7 @@
           <w:szCs w:val="24"/>
           <w:rtl/>
         </w:rPr>
-        <w:t xml:space="preserve">חוקרים@הגיל הרך</w:t>
+        <w:t xml:space="preserve">גילוי דעת</w:t>
       </w:r>
       <w:r>
         <w:rPr>
@@ -6787,7 +6874,54 @@
           <w:szCs w:val="24"/>
           <w:rtl/>
         </w:rPr>
-        <w:t xml:space="preserve">6</w:t>
+        <w:t xml:space="preserve">22</w:t>
+      </w:r>
+      <w:r>
+        <w:rPr>
+          <w:rFonts w:ascii="David" w:cs="David" w:eastAsia="David" w:hAnsi="David"/>
+          <w:b w:val="false"/>
+          <w:bCs w:val="false"/>
+          <w:i w:val="false"/>
+          <w:iCs w:val="false"/>
+          <w:sz w:val="24"/>
+          <w:szCs w:val="24"/>
+          <w:rtl/>
+        </w:rPr>
+        <w:t xml:space="preserve">.</w:t>
+      </w:r>
+    </w:p>
+    <w:p>
+      <w:pPr>
+        <w:bidi/>
+        <w:spacing w:after="120" w:before="0" w:line="360"/>
+        <w:ind w:right="720" w:hanging="720"/>
+        <w:jc w:val="right"/>
+      </w:pPr>
+      <w:r>
+        <w:rPr>
+          <w:rFonts w:ascii="David" w:cs="David" w:eastAsia="David" w:hAnsi="David"/>
+          <w:b w:val="false"/>
+          <w:bCs w:val="false"/>
+          <w:i w:val="false"/>
+          <w:iCs w:val="false"/>
+          <w:sz w:val="24"/>
+          <w:szCs w:val="24"/>
+          <w:rtl/>
+        </w:rPr>
+        <w:t xml:space="preserve">משרד החינוך, המינהל הפדגוגי ומינהל חדשנות וטכנולוגיה. (2026). </w:t>
+      </w:r>
+      <w:r>
+        <w:rPr>
+          <w:rFonts w:ascii="David" w:cs="David" w:eastAsia="David" w:hAnsi="David"/>
+          <w:b w:val="false"/>
+          <w:bCs w:val="false"/>
+          <w:i/>
+          <w:iCs/>
+          <w:sz w:val="24"/>
+          <w:szCs w:val="24"/>
+          <w:rtl/>
+        </w:rPr>
+        <w:t xml:space="preserve">הנחיות שימוש בכלי בינה מלאכותית יוצרת במערכת החינוך</w:t>
       </w:r>
       <w:r>
         <w:rPr>

</xml_diff>